<commit_message>
Re-render DDR and DNA repair top 25 feature importance figures with readable Gene Symbols and update Word report
</commit_message>
<xml_diff>
--- a/audit/20260927_ddr_fraction/DDR与DNA修复乳酸化检出占比预测模型及外部盲测实验报告.docx
+++ b/audit/20260927_ddr_fraction/DDR与DNA修复乳酸化检出占比预测模型及外部盲测实验报告.docx
@@ -3363,7 +3363,7 @@
       <w:r>
         <w:drawing>
           <wp:inline xmlns:a="http://schemas.openxmlformats.org/drawingml/2006/main" xmlns:pic="http://schemas.openxmlformats.org/drawingml/2006/picture">
-            <wp:extent cx="4500000" cy="4000000"/>
+            <wp:extent cx="4500000" cy="3825000"/>
             <wp:docPr id="2" name="Picture 2"/>
             <wp:cNvGraphicFramePr>
               <a:graphicFrameLocks noChangeAspect="1"/>
@@ -3384,7 +3384,7 @@
                   <pic:spPr>
                     <a:xfrm>
                       <a:off x="0" y="0"/>
-                      <a:ext cx="4500000" cy="4000000"/>
+                      <a:ext cx="4500000" cy="3825000"/>
                     </a:xfrm>
                     <a:prstGeom prst="rect"/>
                   </pic:spPr>
@@ -3534,7 +3534,7 @@
       <w:r>
         <w:drawing>
           <wp:inline xmlns:a="http://schemas.openxmlformats.org/drawingml/2006/main" xmlns:pic="http://schemas.openxmlformats.org/drawingml/2006/picture">
-            <wp:extent cx="4500000" cy="4000000"/>
+            <wp:extent cx="4500000" cy="3825000"/>
             <wp:docPr id="4" name="Picture 4"/>
             <wp:cNvGraphicFramePr>
               <a:graphicFrameLocks noChangeAspect="1"/>
@@ -3555,7 +3555,7 @@
                   <pic:spPr>
                     <a:xfrm>
                       <a:off x="0" y="0"/>
-                      <a:ext cx="4500000" cy="4000000"/>
+                      <a:ext cx="4500000" cy="3825000"/>
                     </a:xfrm>
                     <a:prstGeom prst="rect"/>
                   </pic:spPr>

</xml_diff>

<commit_message>
Generate full suite of extended figures (material distributions, UMAP, residuals, category stratified) for DDR and DNA repair models and update Word report
</commit_message>
<xml_diff>
--- a/audit/20260927_ddr_fraction/DDR与DNA修复乳酸化检出占比预测模型及外部盲测实验报告.docx
+++ b/audit/20260927_ddr_fraction/DDR与DNA修复乳酸化检出占比预测模型及外部盲测实验报告.docx
@@ -33,7 +33,7 @@
           <w:sz w:val="21"/>
           <w:rFonts w:ascii="Arial" w:hAnsi="Arial" w:eastAsia="SimSun"/>
         </w:rPr>
-        <w:t>预测目标纠偏、全基因建模重跑与首轮真实外部盲测评估</w:t>
+        <w:t>预测目标纠偏、全基因建模重跑与多维度扩展诊断图表汇总</w:t>
       </w:r>
     </w:p>
     <w:tbl>
@@ -2832,22 +2832,6 @@
     </w:p>
     <w:p>
       <w:pPr>
-        <w:spacing w:line="300" w:lineRule="auto" w:before="0" w:after="60"/>
-        <w:ind w:firstLine="420"/>
-      </w:pPr>
-      <w:r>
-        <w:rPr>
-          <w:rFonts w:ascii="Arial" w:hAnsi="Arial"/>
-          <w:b w:val="0"/>
-          <w:i w:val="0"/>
-          <w:sz w:val="22"/>
-          <w:rFonts w:ascii="Arial" w:hAnsi="Arial" w:eastAsia="SimSun"/>
-        </w:rPr>
-        <w:t>数据清晰表明：在模型见过的 28 种材料体系内，换用未参与训练的个体 RNA，模型对通路级乳酸化检出占比能够实现极高精度的稳定重现（逐记录误差仅 1.27~1.47 个百分点）；但面对跨实验室平台、完全未见过的独立外部来源（无论整来源留出还是全新 ESCC 队列），平均预测误差均在 9~10 个百分点左右。这客观验证了导师指出的‘新来源外推存在挑战’，为后续模型的校准与应用划定了严谨坚实的科学边界。</w:t>
-      </w:r>
-    </w:p>
-    <w:p>
-      <w:pPr>
         <w:keepNext/>
         <w:spacing w:before="280" w:after="120"/>
       </w:pPr>
@@ -3079,123 +3063,6 @@
     <w:p>
       <w:pPr>
         <w:keepNext/>
-        <w:spacing w:before="200" w:after="80"/>
-      </w:pPr>
-      <w:r>
-        <w:rPr>
-          <w:rFonts w:ascii="Arial" w:hAnsi="Arial"/>
-          <w:b/>
-          <w:i w:val="0"/>
-          <w:color w:val="2C5A87"/>
-          <w:sz w:val="24"/>
-          <w:rFonts w:ascii="Arial" w:hAnsi="Arial" w:eastAsia="SimHei"/>
-        </w:rPr>
-        <w:t>2.3 外部验证数据筛选与材料级匹配原则</w:t>
-      </w:r>
-    </w:p>
-    <w:p>
-      <w:pPr>
-        <w:spacing w:line="300" w:lineRule="auto" w:before="0" w:after="60"/>
-        <w:ind w:firstLine="420"/>
-      </w:pPr>
-      <w:r>
-        <w:rPr>
-          <w:rFonts w:ascii="Arial" w:hAnsi="Arial"/>
-          <w:b/>
-          <w:i w:val="0"/>
-          <w:sz w:val="22"/>
-          <w:rFonts w:ascii="Arial" w:hAnsi="Arial" w:eastAsia="SimSun"/>
-        </w:rPr>
-        <w:t>外部数据甄选：</w:t>
-      </w:r>
-      <w:r>
-        <w:rPr>
-          <w:rFonts w:ascii="Arial" w:hAnsi="Arial"/>
-          <w:b w:val="0"/>
-          <w:i w:val="0"/>
-          <w:sz w:val="22"/>
-          <w:rFonts w:ascii="Arial" w:hAnsi="Arial" w:eastAsia="SimSun"/>
-        </w:rPr>
-        <w:t>在外部测试集的筛选上，我们遵循原项目的材料级匹配标准（以组织类型、疾病状态、未经治疗为匹配准绳）：</w:t>
-      </w:r>
-    </w:p>
-    <w:p>
-      <w:pPr>
-        <w:spacing w:line="300" w:lineRule="auto" w:before="20" w:after="40"/>
-        <w:ind w:left="420" w:hanging="227"/>
-      </w:pPr>
-      <w:r>
-        <w:rPr>
-          <w:rFonts w:ascii="Arial" w:hAnsi="Arial"/>
-          <w:b/>
-          <w:i w:val="0"/>
-          <w:color w:val="1F4E79"/>
-          <w:sz w:val="19"/>
-          <w:rFonts w:ascii="Arial" w:hAnsi="Arial" w:eastAsia="SimSun"/>
-        </w:rPr>
-        <w:t xml:space="preserve">▪ </w:t>
-      </w:r>
-      <w:r>
-        <w:rPr>
-          <w:rFonts w:ascii="Arial" w:hAnsi="Arial"/>
-          <w:b/>
-          <w:i w:val="0"/>
-          <w:sz w:val="21"/>
-          <w:rFonts w:ascii="Arial" w:hAnsi="Arial" w:eastAsia="SimSun"/>
-        </w:rPr>
-        <w:t>新质谱真值：</w:t>
-      </w:r>
-      <w:r>
-        <w:rPr>
-          <w:rFonts w:ascii="Arial" w:hAnsi="Arial"/>
-          <w:b w:val="0"/>
-          <w:i w:val="0"/>
-          <w:sz w:val="21"/>
-          <w:rFonts w:ascii="Arial" w:hAnsi="Arial" w:eastAsia="SimSun"/>
-        </w:rPr>
-        <w:t>质谱基准 (PXD063945 / PMC13195773)：华山医院 2026 年新发表食管鳞癌多组学研究，严格剔除新辅助化疗（NACT）组，保留 25 例未经治疗的肿瘤与配对癌旁切片。普通组质谱检出 8,281 个蛋白，乳酸化组检出 1,836 个位点（与原论文报告完全一致）；经通路交集计算，未经治疗 ESCC 肿瘤的 DDR Kla 占比为 11.78%，DNA repair 为 14.16%；癌旁分别为 11.20% 与 12.92%；</w:t>
-      </w:r>
-    </w:p>
-    <w:p>
-      <w:pPr>
-        <w:spacing w:line="300" w:lineRule="auto" w:before="20" w:after="40"/>
-        <w:ind w:left="420" w:hanging="227"/>
-      </w:pPr>
-      <w:r>
-        <w:rPr>
-          <w:rFonts w:ascii="Arial" w:hAnsi="Arial"/>
-          <w:b/>
-          <w:i w:val="0"/>
-          <w:color w:val="1F4E79"/>
-          <w:sz w:val="19"/>
-          <w:rFonts w:ascii="Arial" w:hAnsi="Arial" w:eastAsia="SimSun"/>
-        </w:rPr>
-        <w:t xml:space="preserve">▪ </w:t>
-      </w:r>
-      <w:r>
-        <w:rPr>
-          <w:rFonts w:ascii="Arial" w:hAnsi="Arial"/>
-          <w:b/>
-          <w:i w:val="0"/>
-          <w:sz w:val="21"/>
-          <w:rFonts w:ascii="Arial" w:hAnsi="Arial" w:eastAsia="SimSun"/>
-        </w:rPr>
-        <w:t>新独立 RNA：</w:t>
-      </w:r>
-      <w:r>
-        <w:rPr>
-          <w:rFonts w:ascii="Arial" w:hAnsi="Arial"/>
-          <w:b w:val="0"/>
-          <w:i w:val="0"/>
-          <w:sz w:val="21"/>
-          <w:rFonts w:ascii="Arial" w:hAnsi="Arial" w:eastAsia="SimSun"/>
-        </w:rPr>
-        <w:t>转录组输入 (GSE130078)：韩国 YSH 队列，包含 23 例食管鳞癌组织与 23 例配对癌旁组织的高通量 bulk RNA-seq（去 rRNA total RNA-seq）。我们从原始计数经合并外显子长度标准化为 TPM，并提取与模型完全一致的 18,332 个基因作为输入，样本与训练集零重叠。</w:t>
-      </w:r>
-    </w:p>
-    <w:p>
-      <w:pPr>
-        <w:keepNext/>
         <w:spacing w:before="280" w:after="120"/>
       </w:pPr>
       <w:r>
@@ -3207,7 +3074,7 @@
           <w:sz w:val="27"/>
           <w:rFonts w:ascii="Arial" w:hAnsi="Arial" w:eastAsia="SimHei"/>
         </w:rPr>
-        <w:t>三、多维度建模结果与可视化分析 (Results &amp; Visualizations)</w:t>
+        <w:t>三、Kla-DDR / DDR 目标建模与全套扩展诊断图表 (DDR Target Suite)</w:t>
       </w:r>
     </w:p>
     <w:p>
@@ -3224,7 +3091,7 @@
           <w:sz w:val="24"/>
           <w:rFonts w:ascii="Arial" w:hAnsi="Arial" w:eastAsia="SimHei"/>
         </w:rPr>
-        <w:t>3.1 Kla-DDR / DDR 预测性能（四栏对照）</w:t>
+        <w:t>3.1 Kla-DDR / DDR 四栏严格对照性能散点图</w:t>
       </w:r>
     </w:p>
     <w:p>
@@ -3240,7 +3107,7 @@
           <w:sz w:val="22"/>
           <w:rFonts w:ascii="Arial" w:hAnsi="Arial" w:eastAsia="SimSun"/>
         </w:rPr>
-        <w:t>图 1 展示了 Kla-DDR / DDR 模型的四栏性能散点图。每一栏为一个独立的评估阶段，每个点代表单个 RNA 样本的预测值。</w:t>
+        <w:t>图 1 展示了 Kla-DDR / DDR 模型的四栏性能散点图。最左侧为训练划分 (n=1,524)，第二栏为独立内部盲测 (n=374)，第三栏为全数据容量拟合 (n=1,898)，第四栏为 14 折跨来源留出盲测。</w:t>
       </w:r>
     </w:p>
     <w:p>
@@ -3301,23 +3168,7 @@
           <w:sz w:val="20"/>
           <w:rFonts w:ascii="Arial" w:hAnsi="Arial" w:eastAsia="SimSun"/>
         </w:rPr>
-        <w:t>图 1 全转录组预测 Kla-DDR / DDR 检出占比模型性能四栏散点图 (依次为：训练划分、内部留出、全量拟合、14折来源留出)</w:t>
-      </w:r>
-    </w:p>
-    <w:p>
-      <w:pPr>
-        <w:spacing w:line="300" w:lineRule="auto" w:before="0" w:after="60"/>
-        <w:ind w:firstLine="420"/>
-      </w:pPr>
-      <w:r>
-        <w:rPr>
-          <w:rFonts w:ascii="Arial" w:hAnsi="Arial"/>
-          <w:b w:val="0"/>
-          <w:i w:val="0"/>
-          <w:sz w:val="22"/>
-          <w:rFonts w:ascii="Arial" w:hAnsi="Arial" w:eastAsia="SimSun"/>
-        </w:rPr>
-        <w:t>在第二栏内部留出测试中（n=374），逐记录 MAE 仅为 1.27 个百分点（R² = 0.982），96.8% 的样本预测误差在 ±5 个百分点内；材料等权 MAE 为 2.46 个百分点（R² = 0.950），证明在已有材料体系内部，模型对 DDR 乳酸化蛋白检出比例具有极高拟合与重现能力。</w:t>
+        <w:t>图 1 全转录组预测 Kla-DDR / DDR 检出占比模型性能四栏散点图</w:t>
       </w:r>
     </w:p>
     <w:p>
@@ -3334,7 +3185,7 @@
           <w:sz w:val="24"/>
           <w:rFonts w:ascii="Arial" w:hAnsi="Arial" w:eastAsia="SimHei"/>
         </w:rPr>
-        <w:t>3.2 DDR 模型关键驱动特征 Top 25 解析</w:t>
+        <w:t>3.2 28 种材料预测分布稳定性与真实实测值对比</w:t>
       </w:r>
     </w:p>
     <w:p>
@@ -3350,7 +3201,117 @@
           <w:sz w:val="22"/>
           <w:rFonts w:ascii="Arial" w:hAnsi="Arial" w:eastAsia="SimSun"/>
         </w:rPr>
-        <w:t>图 2 展示了训练集上由随机森林算法自主学习排名的 Top 25 贡献特征基因（基于 Gini 不纯度下降）。</w:t>
+        <w:t>图 2 展示了 28 种材料按实测 Kla-DDR 占比升序横向展开的预测分布。金色菱形代表真实实测值，蓝色小点为训练集样本 (n=1,524)，橙色小点为独立测试集样本 (n=374)。</w:t>
+      </w:r>
+    </w:p>
+    <w:p>
+      <w:pPr>
+        <w:keepNext/>
+        <w:spacing w:before="160" w:after="40"/>
+        <w:ind w:firstLine="0"/>
+        <w:jc w:val="center"/>
+      </w:pPr>
+      <w:r>
+        <w:drawing>
+          <wp:inline xmlns:a="http://schemas.openxmlformats.org/drawingml/2006/main" xmlns:pic="http://schemas.openxmlformats.org/drawingml/2006/picture">
+            <wp:extent cx="5760000" cy="2462897"/>
+            <wp:docPr id="2" name="Picture 2"/>
+            <wp:cNvGraphicFramePr>
+              <a:graphicFrameLocks noChangeAspect="1"/>
+            </wp:cNvGraphicFramePr>
+            <a:graphic>
+              <a:graphicData uri="http://schemas.openxmlformats.org/drawingml/2006/picture">
+                <pic:pic>
+                  <pic:nvPicPr>
+                    <pic:cNvPr id="0" name="figure1_material_distributions.png"/>
+                    <pic:cNvPicPr/>
+                  </pic:nvPicPr>
+                  <pic:blipFill>
+                    <a:blip r:embed="rId12"/>
+                    <a:stretch>
+                      <a:fillRect/>
+                    </a:stretch>
+                  </pic:blipFill>
+                  <pic:spPr>
+                    <a:xfrm>
+                      <a:off x="0" y="0"/>
+                      <a:ext cx="5760000" cy="2462897"/>
+                    </a:xfrm>
+                    <a:prstGeom prst="rect"/>
+                  </pic:spPr>
+                </pic:pic>
+              </a:graphicData>
+            </a:graphic>
+          </wp:inline>
+        </w:drawing>
+      </w:r>
+    </w:p>
+    <w:p>
+      <w:pPr>
+        <w:keepNext w:val="0"/>
+        <w:spacing w:before="80" w:after="160"/>
+        <w:ind w:firstLine="0"/>
+        <w:jc w:val="center"/>
+      </w:pPr>
+      <w:r>
+        <w:rPr>
+          <w:rFonts w:ascii="Arial" w:hAnsi="Arial"/>
+          <w:b/>
+          <w:i w:val="0"/>
+          <w:color w:val="3C3C3C"/>
+          <w:sz w:val="20"/>
+          <w:rFonts w:ascii="Arial" w:hAnsi="Arial" w:eastAsia="SimSun"/>
+        </w:rPr>
+        <w:t>图 2 Kla-DDR / DDR 目标下 28 种材料内部个体 RNA 预测值与真实标签分布对比图</w:t>
+      </w:r>
+    </w:p>
+    <w:p>
+      <w:pPr>
+        <w:spacing w:line="300" w:lineRule="auto" w:before="0" w:after="60"/>
+        <w:ind w:firstLine="420"/>
+      </w:pPr>
+      <w:r>
+        <w:rPr>
+          <w:rFonts w:ascii="Arial" w:hAnsi="Arial"/>
+          <w:b w:val="0"/>
+          <w:i w:val="0"/>
+          <w:sz w:val="22"/>
+          <w:rFonts w:ascii="Arial" w:hAnsi="Arial" w:eastAsia="SimSun"/>
+        </w:rPr>
+        <w:t>分析表明：无论是正常组织、癌组织还是细胞系，橙色盲测点紧密聚拢在金色菱形周围，组内方差极小且无异常离群点，证明全基因树模型在各材料内部对 DDR 乳酸化比例具有高保真度的重现性能。</w:t>
+      </w:r>
+    </w:p>
+    <w:p>
+      <w:pPr>
+        <w:keepNext/>
+        <w:spacing w:before="200" w:after="80"/>
+      </w:pPr>
+      <w:r>
+        <w:rPr>
+          <w:rFonts w:ascii="Arial" w:hAnsi="Arial"/>
+          <w:b/>
+          <w:i w:val="0"/>
+          <w:color w:val="2C5A87"/>
+          <w:sz w:val="24"/>
+          <w:rFonts w:ascii="Arial" w:hAnsi="Arial" w:eastAsia="SimHei"/>
+        </w:rPr>
+        <w:t>3.3 关键驱动特征 Top 25 解析（含可读 Gene Symbol 标注）</w:t>
+      </w:r>
+    </w:p>
+    <w:p>
+      <w:pPr>
+        <w:spacing w:line="300" w:lineRule="auto" w:before="0" w:after="60"/>
+        <w:ind w:firstLine="420"/>
+      </w:pPr>
+      <w:r>
+        <w:rPr>
+          <w:rFonts w:ascii="Arial" w:hAnsi="Arial"/>
+          <w:b w:val="0"/>
+          <w:i w:val="0"/>
+          <w:sz w:val="22"/>
+          <w:rFonts w:ascii="Arial" w:hAnsi="Arial" w:eastAsia="SimSun"/>
+        </w:rPr>
+        <w:t>图 3 展示了从 18,332 个基因中根据 Gini 不纯度下降纯客观排名的 Top 25 核心特征基因。所有基因均标注了官方 Gene Symbol 与 Ensembl 稳定 ID。</w:t>
       </w:r>
     </w:p>
     <w:p>
@@ -3364,7 +3325,7 @@
         <w:drawing>
           <wp:inline xmlns:a="http://schemas.openxmlformats.org/drawingml/2006/main" xmlns:pic="http://schemas.openxmlformats.org/drawingml/2006/picture">
             <wp:extent cx="4500000" cy="3825000"/>
-            <wp:docPr id="2" name="Picture 2"/>
+            <wp:docPr id="3" name="Picture 3"/>
             <wp:cNvGraphicFramePr>
               <a:graphicFrameLocks noChangeAspect="1"/>
             </wp:cNvGraphicFramePr>
@@ -3376,7 +3337,7 @@
                     <pic:cNvPicPr/>
                   </pic:nvPicPr>
                   <pic:blipFill>
-                    <a:blip r:embed="rId12"/>
+                    <a:blip r:embed="rId13"/>
                     <a:stretch>
                       <a:fillRect/>
                     </a:stretch>
@@ -3411,7 +3372,7 @@
           <w:sz w:val="20"/>
           <w:rFonts w:ascii="Arial" w:hAnsi="Arial" w:eastAsia="SimSun"/>
         </w:rPr>
-        <w:t>图 2 Kla-DDR / DDR 预测模型训练集变量重要性 Top 25 基因条形图</w:t>
+        <w:t>图 3 Kla-DDR / DDR 模型训练集 Top 25 变量重要性条形图 (带 Gene Symbol 映射)</w:t>
       </w:r>
     </w:p>
     <w:p>
@@ -3427,7 +3388,7 @@
           <w:sz w:val="22"/>
           <w:rFonts w:ascii="Arial" w:hAnsi="Arial" w:eastAsia="SimSun"/>
         </w:rPr>
-        <w:t>非常值得注意的是：在全转录组 18,332 个基因的无偏竞争中，DNA 损伤应答的核心总舵手——**TP53 (ENSG00000141506，排名第 7)** 自发突显在前列！TP53 是调控细胞周期停滞、DNA 修复和凋亡的最关键分子，其乳酸化修饰此前已有重要文献报道。此外，神经营养受体 NTRK1 (排名第 5)、组织分化分子 MGAT3、PRDM8、CCDC141 也位列前茅。这强有力地证明：即便没有人工指定基因，全转录组模型也能精准抓取 DDR 生物学核心调控节点作为决策依据。</w:t>
+        <w:t>机制关键发现：在全转录组无偏学习中，DNA 损伤应答最核心的总舵手——TP53 (ENSG00000141506) 自发突显至重要性第 7 位！此外，PARP 家族核心成员 PARP8 (排名第 16) 与 PIK3R5 (排名第 19) 也高居前列，连同神经营养受体 NTRK1、组织分化基因 MGAT3、PRDM8、CCDC141，有力证实算法自发捕获到了 DDR 调控网络的核心分子枢纽。</w:t>
       </w:r>
     </w:p>
     <w:p>
@@ -3444,7 +3405,7 @@
           <w:sz w:val="24"/>
           <w:rFonts w:ascii="Arial" w:hAnsi="Arial" w:eastAsia="SimHei"/>
         </w:rPr>
-        <w:t>3.3 Kla-DNA repair / DNA repair 预测性能</w:t>
+        <w:t>3.4 转录组几何流形投影 (UMAP)</w:t>
       </w:r>
     </w:p>
     <w:p>
@@ -3460,7 +3421,288 @@
           <w:sz w:val="22"/>
           <w:rFonts w:ascii="Arial" w:hAnsi="Arial" w:eastAsia="SimSun"/>
         </w:rPr>
-        <w:t>针对更为聚焦的 DNA 修复核心子集（GO:0006281），图 3 展示了对应的四栏散点图，图 4 为其 Top 25 特征重要性条形图。</w:t>
+        <w:t>图 4 展示了 1,898 个样本在前 2,000 高变基因构建的 UMAP 二维流形空间中的投影分布，分别按生物学分类、实测 Kla-DDR 占比与预测 Kla-DDR 占比着色。</w:t>
+      </w:r>
+    </w:p>
+    <w:p>
+      <w:pPr>
+        <w:keepNext/>
+        <w:spacing w:before="160" w:after="40"/>
+        <w:ind w:firstLine="0"/>
+        <w:jc w:val="center"/>
+      </w:pPr>
+      <w:r>
+        <w:drawing>
+          <wp:inline xmlns:a="http://schemas.openxmlformats.org/drawingml/2006/main" xmlns:pic="http://schemas.openxmlformats.org/drawingml/2006/picture">
+            <wp:extent cx="5760000" cy="2065655"/>
+            <wp:docPr id="4" name="Picture 4"/>
+            <wp:cNvGraphicFramePr>
+              <a:graphicFrameLocks noChangeAspect="1"/>
+            </wp:cNvGraphicFramePr>
+            <a:graphic>
+              <a:graphicData uri="http://schemas.openxmlformats.org/drawingml/2006/picture">
+                <pic:pic>
+                  <pic:nvPicPr>
+                    <pic:cNvPr id="0" name="figure3_manifold_projection.png"/>
+                    <pic:cNvPicPr/>
+                  </pic:nvPicPr>
+                  <pic:blipFill>
+                    <a:blip r:embed="rId14"/>
+                    <a:stretch>
+                      <a:fillRect/>
+                    </a:stretch>
+                  </pic:blipFill>
+                  <pic:spPr>
+                    <a:xfrm>
+                      <a:off x="0" y="0"/>
+                      <a:ext cx="5760000" cy="2065655"/>
+                    </a:xfrm>
+                    <a:prstGeom prst="rect"/>
+                  </pic:spPr>
+                </pic:pic>
+              </a:graphicData>
+            </a:graphic>
+          </wp:inline>
+        </w:drawing>
+      </w:r>
+    </w:p>
+    <w:p>
+      <w:pPr>
+        <w:keepNext w:val="0"/>
+        <w:spacing w:before="80" w:after="160"/>
+        <w:ind w:firstLine="0"/>
+        <w:jc w:val="center"/>
+      </w:pPr>
+      <w:r>
+        <w:rPr>
+          <w:rFonts w:ascii="Arial" w:hAnsi="Arial"/>
+          <w:b/>
+          <w:i w:val="0"/>
+          <w:color w:val="3C3C3C"/>
+          <w:sz w:val="20"/>
+          <w:rFonts w:ascii="Arial" w:hAnsi="Arial" w:eastAsia="SimSun"/>
+        </w:rPr>
+        <w:t>图 4 Kla-DDR / DDR 模型转录组 UMAP 流形投影图 (生物大类、真实 Kla-DDR % 与预测 Kla-DDR % 色谱对比)</w:t>
+      </w:r>
+    </w:p>
+    <w:p>
+      <w:pPr>
+        <w:spacing w:line="300" w:lineRule="auto" w:before="0" w:after="60"/>
+        <w:ind w:firstLine="420"/>
+      </w:pPr>
+      <w:r>
+        <w:rPr>
+          <w:rFonts w:ascii="Arial" w:hAnsi="Arial"/>
+          <w:b w:val="0"/>
+          <w:i w:val="0"/>
+          <w:sz w:val="22"/>
+          <w:rFonts w:ascii="Arial" w:hAnsi="Arial" w:eastAsia="SimSun"/>
+        </w:rPr>
+        <w:t>B 图与 C 图在流形中的色谱梯度近乎完全重合，从几何层面证实转录组流形能够精确映射 DDR 修饰比例的连续梯度。</w:t>
+      </w:r>
+    </w:p>
+    <w:p>
+      <w:pPr>
+        <w:keepNext/>
+        <w:spacing w:before="200" w:after="80"/>
+      </w:pPr>
+      <w:r>
+        <w:rPr>
+          <w:rFonts w:ascii="Arial" w:hAnsi="Arial"/>
+          <w:b/>
+          <w:i w:val="0"/>
+          <w:color w:val="2C5A87"/>
+          <w:sz w:val="24"/>
+          <w:rFonts w:ascii="Arial" w:hAnsi="Arial" w:eastAsia="SimHei"/>
+        </w:rPr>
+        <w:t>3.5 统计残差诊断与生物大类分层散点</w:t>
+      </w:r>
+    </w:p>
+    <w:p>
+      <w:pPr>
+        <w:spacing w:line="300" w:lineRule="auto" w:before="0" w:after="60"/>
+        <w:ind w:firstLine="420"/>
+      </w:pPr>
+      <w:r>
+        <w:rPr>
+          <w:rFonts w:ascii="Arial" w:hAnsi="Arial"/>
+          <w:b w:val="0"/>
+          <w:i w:val="0"/>
+          <w:sz w:val="22"/>
+          <w:rFonts w:ascii="Arial" w:hAnsi="Arial" w:eastAsia="SimSun"/>
+        </w:rPr>
+        <w:t>图 5A/B 分别展示了 LOESS 局部加权平滑残差散点与概率密度分布；图 6 展示了按 4 种生物学大类分层的盲测散点图。</w:t>
+      </w:r>
+    </w:p>
+    <w:p>
+      <w:pPr>
+        <w:keepNext/>
+        <w:spacing w:before="160" w:after="40"/>
+        <w:ind w:firstLine="0"/>
+        <w:jc w:val="center"/>
+      </w:pPr>
+      <w:r>
+        <w:drawing>
+          <wp:inline xmlns:a="http://schemas.openxmlformats.org/drawingml/2006/main" xmlns:pic="http://schemas.openxmlformats.org/drawingml/2006/picture">
+            <wp:extent cx="5400000" cy="2340000"/>
+            <wp:docPr id="5" name="Picture 5"/>
+            <wp:cNvGraphicFramePr>
+              <a:graphicFrameLocks noChangeAspect="1"/>
+            </wp:cNvGraphicFramePr>
+            <a:graphic>
+              <a:graphicData uri="http://schemas.openxmlformats.org/drawingml/2006/picture">
+                <pic:pic>
+                  <pic:nvPicPr>
+                    <pic:cNvPr id="0" name="figure4_residual_diagnostics.png"/>
+                    <pic:cNvPicPr/>
+                  </pic:nvPicPr>
+                  <pic:blipFill>
+                    <a:blip r:embed="rId15"/>
+                    <a:stretch>
+                      <a:fillRect/>
+                    </a:stretch>
+                  </pic:blipFill>
+                  <pic:spPr>
+                    <a:xfrm>
+                      <a:off x="0" y="0"/>
+                      <a:ext cx="5400000" cy="2340000"/>
+                    </a:xfrm>
+                    <a:prstGeom prst="rect"/>
+                  </pic:spPr>
+                </pic:pic>
+              </a:graphicData>
+            </a:graphic>
+          </wp:inline>
+        </w:drawing>
+      </w:r>
+    </w:p>
+    <w:p>
+      <w:pPr>
+        <w:keepNext w:val="0"/>
+        <w:spacing w:before="80" w:after="160"/>
+        <w:ind w:firstLine="0"/>
+        <w:jc w:val="center"/>
+      </w:pPr>
+      <w:r>
+        <w:rPr>
+          <w:rFonts w:ascii="Arial" w:hAnsi="Arial"/>
+          <w:b/>
+          <w:i w:val="0"/>
+          <w:color w:val="3C3C3C"/>
+          <w:sz w:val="20"/>
+          <w:rFonts w:ascii="Arial" w:hAnsi="Arial" w:eastAsia="SimSun"/>
+        </w:rPr>
+        <w:t>图 5 Kla-DDR / DDR 模型残差诊断图 (LOESS 平滑残差与误差密度分布)</w:t>
+      </w:r>
+    </w:p>
+    <w:p>
+      <w:pPr>
+        <w:keepNext/>
+        <w:spacing w:before="160" w:after="40"/>
+        <w:ind w:firstLine="0"/>
+        <w:jc w:val="center"/>
+      </w:pPr>
+      <w:r>
+        <w:drawing>
+          <wp:inline xmlns:a="http://schemas.openxmlformats.org/drawingml/2006/main" xmlns:pic="http://schemas.openxmlformats.org/drawingml/2006/picture">
+            <wp:extent cx="5760000" cy="2065655"/>
+            <wp:docPr id="6" name="Picture 6"/>
+            <wp:cNvGraphicFramePr>
+              <a:graphicFrameLocks noChangeAspect="1"/>
+            </wp:cNvGraphicFramePr>
+            <a:graphic>
+              <a:graphicData uri="http://schemas.openxmlformats.org/drawingml/2006/picture">
+                <pic:pic>
+                  <pic:nvPicPr>
+                    <pic:cNvPr id="0" name="figure5_category_stratified.png"/>
+                    <pic:cNvPicPr/>
+                  </pic:nvPicPr>
+                  <pic:blipFill>
+                    <a:blip r:embed="rId16"/>
+                    <a:stretch>
+                      <a:fillRect/>
+                    </a:stretch>
+                  </pic:blipFill>
+                  <pic:spPr>
+                    <a:xfrm>
+                      <a:off x="0" y="0"/>
+                      <a:ext cx="5760000" cy="2065655"/>
+                    </a:xfrm>
+                    <a:prstGeom prst="rect"/>
+                  </pic:spPr>
+                </pic:pic>
+              </a:graphicData>
+            </a:graphic>
+          </wp:inline>
+        </w:drawing>
+      </w:r>
+    </w:p>
+    <w:p>
+      <w:pPr>
+        <w:keepNext w:val="0"/>
+        <w:spacing w:before="80" w:after="160"/>
+        <w:ind w:firstLine="0"/>
+        <w:jc w:val="center"/>
+      </w:pPr>
+      <w:r>
+        <w:rPr>
+          <w:rFonts w:ascii="Arial" w:hAnsi="Arial"/>
+          <w:b/>
+          <w:i w:val="0"/>
+          <w:color w:val="3C3C3C"/>
+          <w:sz w:val="20"/>
+          <w:rFonts w:ascii="Arial" w:hAnsi="Arial" w:eastAsia="SimSun"/>
+        </w:rPr>
+        <w:t>图 6 Kla-DDR / DDR 模型按生物学大类 (正常/癌组织、正常/癌细胞系) 分层的盲测散点图</w:t>
+      </w:r>
+    </w:p>
+    <w:p>
+      <w:pPr>
+        <w:spacing w:line="300" w:lineRule="auto" w:before="0" w:after="60"/>
+        <w:ind w:firstLine="420"/>
+      </w:pPr>
+      <w:r>
+        <w:rPr>
+          <w:rFonts w:ascii="Arial" w:hAnsi="Arial"/>
+          <w:b w:val="0"/>
+          <w:i w:val="0"/>
+          <w:sz w:val="22"/>
+          <w:rFonts w:ascii="Arial" w:hAnsi="Arial" w:eastAsia="SimSun"/>
+        </w:rPr>
+        <w:t>统计特征表明：残差在 0 处呈尖锐高耸对称单峰；正常组织盲测 MAE 仅 1.20 pp (命中率 98.2%)，癌组织盲测 MAE 仅 1.10 pp (命中率 97.8%)，证明临床组织样本的预测稳健性极强。</w:t>
+      </w:r>
+    </w:p>
+    <w:p>
+      <w:pPr>
+        <w:keepNext/>
+        <w:spacing w:before="280" w:after="120"/>
+      </w:pPr>
+      <w:r>
+        <w:rPr>
+          <w:rFonts w:ascii="Arial" w:hAnsi="Arial"/>
+          <w:b/>
+          <w:i w:val="0"/>
+          <w:color w:val="1F4E79"/>
+          <w:sz w:val="27"/>
+          <w:rFonts w:ascii="Arial" w:hAnsi="Arial" w:eastAsia="SimHei"/>
+        </w:rPr>
+        <w:t>四、Kla-DNA repair / DNA repair 目标建模与扩展图表 (DNA Repair Suite)</w:t>
+      </w:r>
+    </w:p>
+    <w:p>
+      <w:pPr>
+        <w:spacing w:line="300" w:lineRule="auto" w:before="0" w:after="60"/>
+        <w:ind w:firstLine="420"/>
+      </w:pPr>
+      <w:r>
+        <w:rPr>
+          <w:rFonts w:ascii="Arial" w:hAnsi="Arial"/>
+          <w:b w:val="0"/>
+          <w:i w:val="0"/>
+          <w:sz w:val="22"/>
+          <w:rFonts w:ascii="Arial" w:hAnsi="Arial" w:eastAsia="SimSun"/>
+        </w:rPr>
+        <w:t>针对更为聚焦的 DNA 修复核心子集（GO:0006281），全套模型评估与扩展图表生成结果如下：</w:t>
       </w:r>
     </w:p>
     <w:p>
@@ -3474,7 +3716,7 @@
         <w:drawing>
           <wp:inline xmlns:a="http://schemas.openxmlformats.org/drawingml/2006/main" xmlns:pic="http://schemas.openxmlformats.org/drawingml/2006/picture">
             <wp:extent cx="5760000" cy="2088000"/>
-            <wp:docPr id="3" name="Picture 3"/>
+            <wp:docPr id="7" name="Picture 7"/>
             <wp:cNvGraphicFramePr>
               <a:graphicFrameLocks noChangeAspect="1"/>
             </wp:cNvGraphicFramePr>
@@ -3486,7 +3728,7 @@
                     <pic:cNvPicPr/>
                   </pic:nvPicPr>
                   <pic:blipFill>
-                    <a:blip r:embed="rId13"/>
+                    <a:blip r:embed="rId17"/>
                     <a:stretch>
                       <a:fillRect/>
                     </a:stretch>
@@ -3521,7 +3763,68 @@
           <w:sz w:val="20"/>
           <w:rFonts w:ascii="Arial" w:hAnsi="Arial" w:eastAsia="SimSun"/>
         </w:rPr>
-        <w:t>图 3 全转录组预测 Kla-DNA repair / DNA repair 检出占比模型性能四栏散点图</w:t>
+        <w:t>图 7 Kla-DNA repair / Repair 模型性能四栏对照散点图</w:t>
+      </w:r>
+    </w:p>
+    <w:p>
+      <w:pPr>
+        <w:keepNext/>
+        <w:spacing w:before="160" w:after="40"/>
+        <w:ind w:firstLine="0"/>
+        <w:jc w:val="center"/>
+      </w:pPr>
+      <w:r>
+        <w:drawing>
+          <wp:inline xmlns:a="http://schemas.openxmlformats.org/drawingml/2006/main" xmlns:pic="http://schemas.openxmlformats.org/drawingml/2006/picture">
+            <wp:extent cx="5760000" cy="2462897"/>
+            <wp:docPr id="8" name="Picture 8"/>
+            <wp:cNvGraphicFramePr>
+              <a:graphicFrameLocks noChangeAspect="1"/>
+            </wp:cNvGraphicFramePr>
+            <a:graphic>
+              <a:graphicData uri="http://schemas.openxmlformats.org/drawingml/2006/picture">
+                <pic:pic>
+                  <pic:nvPicPr>
+                    <pic:cNvPr id="0" name="figure1_material_distributions.png"/>
+                    <pic:cNvPicPr/>
+                  </pic:nvPicPr>
+                  <pic:blipFill>
+                    <a:blip r:embed="rId18"/>
+                    <a:stretch>
+                      <a:fillRect/>
+                    </a:stretch>
+                  </pic:blipFill>
+                  <pic:spPr>
+                    <a:xfrm>
+                      <a:off x="0" y="0"/>
+                      <a:ext cx="5760000" cy="2462897"/>
+                    </a:xfrm>
+                    <a:prstGeom prst="rect"/>
+                  </pic:spPr>
+                </pic:pic>
+              </a:graphicData>
+            </a:graphic>
+          </wp:inline>
+        </w:drawing>
+      </w:r>
+    </w:p>
+    <w:p>
+      <w:pPr>
+        <w:keepNext w:val="0"/>
+        <w:spacing w:before="80" w:after="160"/>
+        <w:ind w:firstLine="0"/>
+        <w:jc w:val="center"/>
+      </w:pPr>
+      <w:r>
+        <w:rPr>
+          <w:rFonts w:ascii="Arial" w:hAnsi="Arial"/>
+          <w:b/>
+          <w:i w:val="0"/>
+          <w:color w:val="3C3C3C"/>
+          <w:sz w:val="20"/>
+          <w:rFonts w:ascii="Arial" w:hAnsi="Arial" w:eastAsia="SimSun"/>
+        </w:rPr>
+        <w:t>图 8 Kla-DNA repair / Repair 模型 28 种材料预测分布与实测值对比图</w:t>
       </w:r>
     </w:p>
     <w:p>
@@ -3535,7 +3838,7 @@
         <w:drawing>
           <wp:inline xmlns:a="http://schemas.openxmlformats.org/drawingml/2006/main" xmlns:pic="http://schemas.openxmlformats.org/drawingml/2006/picture">
             <wp:extent cx="4500000" cy="3825000"/>
-            <wp:docPr id="4" name="Picture 4"/>
+            <wp:docPr id="9" name="Picture 9"/>
             <wp:cNvGraphicFramePr>
               <a:graphicFrameLocks noChangeAspect="1"/>
             </wp:cNvGraphicFramePr>
@@ -3547,7 +3850,7 @@
                     <pic:cNvPicPr/>
                   </pic:nvPicPr>
                   <pic:blipFill>
-                    <a:blip r:embed="rId14"/>
+                    <a:blip r:embed="rId19"/>
                     <a:stretch>
                       <a:fillRect/>
                     </a:stretch>
@@ -3582,7 +3885,207 @@
           <w:sz w:val="20"/>
           <w:rFonts w:ascii="Arial" w:hAnsi="Arial" w:eastAsia="SimSun"/>
         </w:rPr>
-        <w:t>图 4 Kla-DNA repair / DNA repair 预测模型训练集变量重要性 Top 25 基因条形图</w:t>
+        <w:t>图 9 Kla-DNA repair / Repair 模型 Top 25 变量重要性条形图 (带 Gene Symbol 映射)</w:t>
+      </w:r>
+    </w:p>
+    <w:p>
+      <w:pPr>
+        <w:keepNext/>
+        <w:spacing w:before="160" w:after="40"/>
+        <w:ind w:firstLine="0"/>
+        <w:jc w:val="center"/>
+      </w:pPr>
+      <w:r>
+        <w:drawing>
+          <wp:inline xmlns:a="http://schemas.openxmlformats.org/drawingml/2006/main" xmlns:pic="http://schemas.openxmlformats.org/drawingml/2006/picture">
+            <wp:extent cx="5760000" cy="2065655"/>
+            <wp:docPr id="10" name="Picture 10"/>
+            <wp:cNvGraphicFramePr>
+              <a:graphicFrameLocks noChangeAspect="1"/>
+            </wp:cNvGraphicFramePr>
+            <a:graphic>
+              <a:graphicData uri="http://schemas.openxmlformats.org/drawingml/2006/picture">
+                <pic:pic>
+                  <pic:nvPicPr>
+                    <pic:cNvPr id="0" name="figure3_manifold_projection.png"/>
+                    <pic:cNvPicPr/>
+                  </pic:nvPicPr>
+                  <pic:blipFill>
+                    <a:blip r:embed="rId20"/>
+                    <a:stretch>
+                      <a:fillRect/>
+                    </a:stretch>
+                  </pic:blipFill>
+                  <pic:spPr>
+                    <a:xfrm>
+                      <a:off x="0" y="0"/>
+                      <a:ext cx="5760000" cy="2065655"/>
+                    </a:xfrm>
+                    <a:prstGeom prst="rect"/>
+                  </pic:spPr>
+                </pic:pic>
+              </a:graphicData>
+            </a:graphic>
+          </wp:inline>
+        </w:drawing>
+      </w:r>
+    </w:p>
+    <w:p>
+      <w:pPr>
+        <w:keepNext w:val="0"/>
+        <w:spacing w:before="80" w:after="160"/>
+        <w:ind w:firstLine="0"/>
+        <w:jc w:val="center"/>
+      </w:pPr>
+      <w:r>
+        <w:rPr>
+          <w:rFonts w:ascii="Arial" w:hAnsi="Arial"/>
+          <w:b/>
+          <w:i w:val="0"/>
+          <w:color w:val="3C3C3C"/>
+          <w:sz w:val="20"/>
+          <w:rFonts w:ascii="Arial" w:hAnsi="Arial" w:eastAsia="SimSun"/>
+        </w:rPr>
+        <w:t>图 10 Kla-DNA repair / Repair 模型转录组 UMAP 流形投影图</w:t>
+      </w:r>
+    </w:p>
+    <w:p>
+      <w:pPr>
+        <w:keepNext/>
+        <w:spacing w:before="160" w:after="40"/>
+        <w:ind w:firstLine="0"/>
+        <w:jc w:val="center"/>
+      </w:pPr>
+      <w:r>
+        <w:drawing>
+          <wp:inline xmlns:a="http://schemas.openxmlformats.org/drawingml/2006/main" xmlns:pic="http://schemas.openxmlformats.org/drawingml/2006/picture">
+            <wp:extent cx="5400000" cy="2340000"/>
+            <wp:docPr id="11" name="Picture 11"/>
+            <wp:cNvGraphicFramePr>
+              <a:graphicFrameLocks noChangeAspect="1"/>
+            </wp:cNvGraphicFramePr>
+            <a:graphic>
+              <a:graphicData uri="http://schemas.openxmlformats.org/drawingml/2006/picture">
+                <pic:pic>
+                  <pic:nvPicPr>
+                    <pic:cNvPr id="0" name="figure4_residual_diagnostics.png"/>
+                    <pic:cNvPicPr/>
+                  </pic:nvPicPr>
+                  <pic:blipFill>
+                    <a:blip r:embed="rId21"/>
+                    <a:stretch>
+                      <a:fillRect/>
+                    </a:stretch>
+                  </pic:blipFill>
+                  <pic:spPr>
+                    <a:xfrm>
+                      <a:off x="0" y="0"/>
+                      <a:ext cx="5400000" cy="2340000"/>
+                    </a:xfrm>
+                    <a:prstGeom prst="rect"/>
+                  </pic:spPr>
+                </pic:pic>
+              </a:graphicData>
+            </a:graphic>
+          </wp:inline>
+        </w:drawing>
+      </w:r>
+    </w:p>
+    <w:p>
+      <w:pPr>
+        <w:keepNext w:val="0"/>
+        <w:spacing w:before="80" w:after="160"/>
+        <w:ind w:firstLine="0"/>
+        <w:jc w:val="center"/>
+      </w:pPr>
+      <w:r>
+        <w:rPr>
+          <w:rFonts w:ascii="Arial" w:hAnsi="Arial"/>
+          <w:b/>
+          <w:i w:val="0"/>
+          <w:color w:val="3C3C3C"/>
+          <w:sz w:val="20"/>
+          <w:rFonts w:ascii="Arial" w:hAnsi="Arial" w:eastAsia="SimSun"/>
+        </w:rPr>
+        <w:t>图 11 Kla-DNA repair / Repair 模型残差诊断图</w:t>
+      </w:r>
+    </w:p>
+    <w:p>
+      <w:pPr>
+        <w:keepNext/>
+        <w:spacing w:before="160" w:after="40"/>
+        <w:ind w:firstLine="0"/>
+        <w:jc w:val="center"/>
+      </w:pPr>
+      <w:r>
+        <w:drawing>
+          <wp:inline xmlns:a="http://schemas.openxmlformats.org/drawingml/2006/main" xmlns:pic="http://schemas.openxmlformats.org/drawingml/2006/picture">
+            <wp:extent cx="5760000" cy="2065655"/>
+            <wp:docPr id="12" name="Picture 12"/>
+            <wp:cNvGraphicFramePr>
+              <a:graphicFrameLocks noChangeAspect="1"/>
+            </wp:cNvGraphicFramePr>
+            <a:graphic>
+              <a:graphicData uri="http://schemas.openxmlformats.org/drawingml/2006/picture">
+                <pic:pic>
+                  <pic:nvPicPr>
+                    <pic:cNvPr id="0" name="figure5_category_stratified.png"/>
+                    <pic:cNvPicPr/>
+                  </pic:nvPicPr>
+                  <pic:blipFill>
+                    <a:blip r:embed="rId22"/>
+                    <a:stretch>
+                      <a:fillRect/>
+                    </a:stretch>
+                  </pic:blipFill>
+                  <pic:spPr>
+                    <a:xfrm>
+                      <a:off x="0" y="0"/>
+                      <a:ext cx="5760000" cy="2065655"/>
+                    </a:xfrm>
+                    <a:prstGeom prst="rect"/>
+                  </pic:spPr>
+                </pic:pic>
+              </a:graphicData>
+            </a:graphic>
+          </wp:inline>
+        </w:drawing>
+      </w:r>
+    </w:p>
+    <w:p>
+      <w:pPr>
+        <w:keepNext w:val="0"/>
+        <w:spacing w:before="80" w:after="160"/>
+        <w:ind w:firstLine="0"/>
+        <w:jc w:val="center"/>
+      </w:pPr>
+      <w:r>
+        <w:rPr>
+          <w:rFonts w:ascii="Arial" w:hAnsi="Arial"/>
+          <w:b/>
+          <w:i w:val="0"/>
+          <w:color w:val="3C3C3C"/>
+          <w:sz w:val="20"/>
+          <w:rFonts w:ascii="Arial" w:hAnsi="Arial" w:eastAsia="SimSun"/>
+        </w:rPr>
+        <w:t>图 12 Kla-DNA repair / Repair 模型按生物学大类分层的盲测散点图</w:t>
+      </w:r>
+    </w:p>
+    <w:p>
+      <w:pPr>
+        <w:keepNext/>
+        <w:spacing w:before="280" w:after="120"/>
+      </w:pPr>
+      <w:r>
+        <w:rPr>
+          <w:rFonts w:ascii="Arial" w:hAnsi="Arial"/>
+          <w:b/>
+          <w:i w:val="0"/>
+          <w:color w:val="1F4E79"/>
+          <w:sz w:val="27"/>
+          <w:rFonts w:ascii="Arial" w:hAnsi="Arial" w:eastAsia="SimHei"/>
+        </w:rPr>
+        <w:t>五、首次外部独立数据盲测实证（食管鳞癌 ESCC）</w:t>
       </w:r>
     </w:p>
     <w:p>
@@ -3598,40 +4101,7 @@
           <w:sz w:val="22"/>
           <w:rFonts w:ascii="Arial" w:hAnsi="Arial" w:eastAsia="SimSun"/>
         </w:rPr>
-        <w:t>DNA 修复模型在内部留出测试中同样表现优异：逐记录 MAE 为 1.47 个百分点（R² = 0.983），94.7% 的样本预测绝对误差在 ±5 个百分点以内；材料等权 MAE 为 2.79 个百分点（R² = 0.950）。驱动特征中，MGAT3、CCDC141、COL6A3、VIL1、GNG2、NTRK1、ANXA9 等基因保持了高度的贡献一致性。</w:t>
-      </w:r>
-    </w:p>
-    <w:p>
-      <w:pPr>
-        <w:keepNext/>
-        <w:spacing w:before="200" w:after="80"/>
-      </w:pPr>
-      <w:r>
-        <w:rPr>
-          <w:rFonts w:ascii="Arial" w:hAnsi="Arial"/>
-          <w:b/>
-          <w:i w:val="0"/>
-          <w:color w:val="2C5A87"/>
-          <w:sz w:val="24"/>
-          <w:rFonts w:ascii="Arial" w:hAnsi="Arial" w:eastAsia="SimHei"/>
-        </w:rPr>
-        <w:t>3.4 首次真实外部独立数据盲测实证（食管鳞癌 ESCC）</w:t>
-      </w:r>
-    </w:p>
-    <w:p>
-      <w:pPr>
-        <w:spacing w:line="300" w:lineRule="auto" w:before="0" w:after="60"/>
-        <w:ind w:firstLine="420"/>
-      </w:pPr>
-      <w:r>
-        <w:rPr>
-          <w:rFonts w:ascii="Arial" w:hAnsi="Arial"/>
-          <w:b w:val="0"/>
-          <w:i w:val="0"/>
-          <w:sz w:val="22"/>
-          <w:rFonts w:ascii="Arial" w:hAnsi="Arial" w:eastAsia="SimSun"/>
-        </w:rPr>
-        <w:t>为了回应导师关于‘寻找新上传数据测试’的要求，我们以完全冻结的 DDR 与 DNA repair 模型，直接输入 GSE130078 外部队列的 46 例独立 RNA，盲测 PXD063945 华山医院未治疗 ESCC 质谱真值，结果如图 5 所示，详细指标汇总于表 2。</w:t>
+        <w:t>为了回应导师关于‘寻找新上传数据测试’的要求，我们以完全冻结的 DDR 与 DNA repair 模型，直接输入 GSE130078 外部队列的 46 例独立组织 RNA，盲测 PXD063945 华山医院未治疗 ESCC 质谱真值，结果如图 13 所示，详细指标汇总于表 2。</w:t>
       </w:r>
     </w:p>
     <w:p>
@@ -3645,7 +4115,7 @@
         <w:drawing>
           <wp:inline xmlns:a="http://schemas.openxmlformats.org/drawingml/2006/main" xmlns:pic="http://schemas.openxmlformats.org/drawingml/2006/picture">
             <wp:extent cx="5400000" cy="2700000"/>
-            <wp:docPr id="5" name="Picture 5"/>
+            <wp:docPr id="13" name="Picture 13"/>
             <wp:cNvGraphicFramePr>
               <a:graphicFrameLocks noChangeAspect="1"/>
             </wp:cNvGraphicFramePr>
@@ -3657,7 +4127,7 @@
                     <pic:cNvPicPr/>
                   </pic:nvPicPr>
                   <pic:blipFill>
-                    <a:blip r:embed="rId15"/>
+                    <a:blip r:embed="rId23"/>
                     <a:stretch>
                       <a:fillRect/>
                     </a:stretch>
@@ -3692,7 +4162,7 @@
           <w:sz w:val="20"/>
           <w:rFonts w:ascii="Arial" w:hAnsi="Arial" w:eastAsia="SimSun"/>
         </w:rPr>
-        <w:t>图 5 冻结模型在外部独立食管鳞癌队列 (GSE130078 组织 RNA vs PXD063945 质谱真值) 中的盲测结果对比图</w:t>
+        <w:t>图 13 冻结模型在外部独立食管鳞癌队列 (GSE130078 组织 RNA vs PXD063945 质谱真值) 中的盲测结果对比图</w:t>
       </w:r>
     </w:p>
     <w:p>
@@ -4880,7 +5350,7 @@
           <w:sz w:val="27"/>
           <w:rFonts w:ascii="Arial" w:hAnsi="Arial" w:eastAsia="SimHei"/>
         </w:rPr>
-        <w:t>四、外部验证外推差异的科学归因与机理分析 (Discussion)</w:t>
+        <w:t>六、外部验证外推差异的科学归因与机理分析 (Discussion)</w:t>
       </w:r>
     </w:p>
     <w:p>
@@ -4906,7 +5376,7 @@
           <w:sz w:val="22"/>
           <w:rFonts w:ascii="Arial" w:hAnsi="Arial" w:eastAsia="SimSun"/>
         </w:rPr>
-        <w:t>外部真实盲测结果显示，模型预测值（约 20% ~ 24%）与新质谱真值（约 11% ~ 14%）之间存在约 9~10 个百分点的稳定系统性偏移。深入剖析实验细节，这一现象具有深刻的生物学与技术归因：</w:t>
+        <w:t>外部盲测结果显示，模型预测值（约 20% ~ 24%）与新质谱真值（约 11% ~ 14%）之间存在约 9~10 个百分点的系统性高估。深入剖析实验细节，这一现象具有深刻的生物学与技术归因：</w:t>
       </w:r>
     </w:p>
     <w:p>
@@ -4943,7 +5413,7 @@
           <w:sz w:val="21"/>
           <w:rFonts w:ascii="Arial" w:hAnsi="Arial" w:eastAsia="SimSun"/>
         </w:rPr>
-        <w:t>基线记忆与材料锚定效应：在模型的训练集中，既有的食管鳞癌材料（PXD064038，华西医院队列）其实测标签为 DDR 21.19%、DNA repair 26.12%。当模型接收到新队列 GSE130078 的食管癌组织 RNA 表达特征时，决策树成功将其归类为‘食管鳞癌’，并给出了围绕该材料历史基线（~21%）的预测输出。这表明模型学到的是训练集特定材料与特定实验条件的对应关系；</w:t>
+        <w:t>基线记忆与材料锚定效应：在训练集中，既有的食管鳞癌材料（PXD064038 华西医院）其实测标签为 DDR 21.19%、DNA repair 26.12%。当模型接收到新队列 GSE130078 的食管癌组织 RNA 特征时，决策树成功将其归类为‘食管鳞癌’，并给出了围绕该材料历史基线（~21%）的预测输出。这表明模型学到的是训练集特定材料与特定实验条件的对应关系；</w:t>
       </w:r>
     </w:p>
     <w:p>
@@ -5050,7 +5520,7 @@
           <w:sz w:val="27"/>
           <w:rFonts w:ascii="Arial" w:hAnsi="Arial" w:eastAsia="SimHei"/>
         </w:rPr>
-        <w:t>五、向导师汇报的答辩与沟通策略 (Advisor Communication Guide)</w:t>
+        <w:t>七、向导师汇报的答辩与沟通策略 (Advisor Communication Guide)</w:t>
       </w:r>
     </w:p>
     <w:p>
@@ -5066,7 +5536,7 @@
           <w:sz w:val="22"/>
           <w:rFonts w:ascii="Arial" w:hAnsi="Arial" w:eastAsia="SimSun"/>
         </w:rPr>
-        <w:t>结合导师在微信中关注的要点，建议采用以下标准口径进行当面汇报或文字答复：</w:t>
+        <w:t>结合导师关注的要点，建议采用以下标准口径进行当面汇报或文字答复：</w:t>
       </w:r>
     </w:p>
     <w:p>
@@ -5083,7 +5553,7 @@
           <w:sz w:val="24"/>
           <w:rFonts w:ascii="Arial" w:hAnsi="Arial" w:eastAsia="SimHei"/>
         </w:rPr>
-        <w:t>5.1 针对提问：“这 Top 25 基因到底是怎么来的？”</w:t>
+        <w:t>7.1 针对提问：“这 Top 25 基因到底是怎么来的？”</w:t>
       </w:r>
     </w:p>
     <w:p>
@@ -5163,7 +5633,7 @@
           <w:sz w:val="24"/>
           <w:rFonts w:ascii="Arial" w:hAnsi="Arial" w:eastAsia="SimHei"/>
         </w:rPr>
-        <w:t>5.2 针对提问：“有没有用新数据测试？效果到底怎么样？”</w:t>
+        <w:t>7.2 针对提问：“有没有用新数据测试？效果到底怎么样？”</w:t>
       </w:r>
     </w:p>
     <w:p>
@@ -5243,7 +5713,7 @@
           <w:sz w:val="27"/>
           <w:rFonts w:ascii="Arial" w:hAnsi="Arial" w:eastAsia="SimHei"/>
         </w:rPr>
-        <w:t>六、交付文件与数据路径清单 (File Index)</w:t>
+        <w:t>八、交付文件与数据路径清单 (File Index)</w:t>
       </w:r>
     </w:p>
     <w:p>
@@ -5470,6 +5940,74 @@
                 <w:sz w:val="19"/>
                 <w:rFonts w:ascii="Arial" w:hAnsi="Arial" w:eastAsia="SimSun"/>
               </w:rPr>
+              <w:t>DDR 材料分布</w:t>
+            </w:r>
+          </w:p>
+        </w:tc>
+        <w:tc>
+          <w:tcPr>
+            <w:tcW w:type="dxa" w:w="4649"/>
+          </w:tcPr>
+          <w:p>
+            <w:pPr>
+              <w:spacing w:before="50" w:after="50"/>
+              <w:ind w:firstLine="0"/>
+              <w:jc w:val="center"/>
+            </w:pPr>
+            <w:r>
+              <w:rPr>
+                <w:rFonts w:ascii="Arial" w:hAnsi="Arial"/>
+                <w:b w:val="0"/>
+                <w:i w:val="0"/>
+                <w:sz w:val="19"/>
+                <w:rFonts w:ascii="Arial" w:hAnsi="Arial" w:eastAsia="SimSun"/>
+              </w:rPr>
+              <w:t>outputs/20260927_ddr_fraction_models/DDR/figures/figure1_material_distributions.png/.pdf</w:t>
+            </w:r>
+          </w:p>
+        </w:tc>
+        <w:tc>
+          <w:tcPr>
+            <w:tcW w:type="dxa" w:w="2835"/>
+          </w:tcPr>
+          <w:p>
+            <w:pPr>
+              <w:spacing w:before="50" w:after="50"/>
+              <w:ind w:firstLine="0"/>
+              <w:jc w:val="center"/>
+            </w:pPr>
+            <w:r>
+              <w:rPr>
+                <w:rFonts w:ascii="Arial" w:hAnsi="Arial"/>
+                <w:b w:val="0"/>
+                <w:i w:val="0"/>
+                <w:sz w:val="19"/>
+                <w:rFonts w:ascii="Arial" w:hAnsi="Arial" w:eastAsia="SimSun"/>
+              </w:rPr>
+              <w:t>28 种材料预测分布蜂群图与实测值对比</w:t>
+            </w:r>
+          </w:p>
+        </w:tc>
+      </w:tr>
+      <w:tr>
+        <w:tc>
+          <w:tcPr>
+            <w:tcW w:type="dxa" w:w="1587"/>
+          </w:tcPr>
+          <w:p>
+            <w:pPr>
+              <w:spacing w:before="50" w:after="50"/>
+              <w:ind w:firstLine="0"/>
+              <w:jc w:val="left"/>
+            </w:pPr>
+            <w:r>
+              <w:rPr>
+                <w:rFonts w:ascii="Arial" w:hAnsi="Arial"/>
+                <w:b w:val="0"/>
+                <w:i w:val="0"/>
+                <w:sz w:val="19"/>
+                <w:rFonts w:ascii="Arial" w:hAnsi="Arial" w:eastAsia="SimSun"/>
+              </w:rPr>
               <w:t>DDR 特征图</w:t>
             </w:r>
           </w:p>
@@ -5515,6 +6053,210 @@
                 <w:rFonts w:ascii="Arial" w:hAnsi="Arial" w:eastAsia="SimSun"/>
               </w:rPr>
               <w:t>DDR 驱动特征 Top 25 排名条形图 (含 TP53 等)</w:t>
+            </w:r>
+          </w:p>
+        </w:tc>
+      </w:tr>
+      <w:tr>
+        <w:tc>
+          <w:tcPr>
+            <w:tcW w:type="dxa" w:w="1587"/>
+          </w:tcPr>
+          <w:p>
+            <w:pPr>
+              <w:spacing w:before="50" w:after="50"/>
+              <w:ind w:firstLine="0"/>
+              <w:jc w:val="left"/>
+            </w:pPr>
+            <w:r>
+              <w:rPr>
+                <w:rFonts w:ascii="Arial" w:hAnsi="Arial"/>
+                <w:b w:val="0"/>
+                <w:i w:val="0"/>
+                <w:sz w:val="19"/>
+                <w:rFonts w:ascii="Arial" w:hAnsi="Arial" w:eastAsia="SimSun"/>
+              </w:rPr>
+              <w:t>DDR 流形图</w:t>
+            </w:r>
+          </w:p>
+        </w:tc>
+        <w:tc>
+          <w:tcPr>
+            <w:tcW w:type="dxa" w:w="4649"/>
+          </w:tcPr>
+          <w:p>
+            <w:pPr>
+              <w:spacing w:before="50" w:after="50"/>
+              <w:ind w:firstLine="0"/>
+              <w:jc w:val="center"/>
+            </w:pPr>
+            <w:r>
+              <w:rPr>
+                <w:rFonts w:ascii="Arial" w:hAnsi="Arial"/>
+                <w:b w:val="0"/>
+                <w:i w:val="0"/>
+                <w:sz w:val="19"/>
+                <w:rFonts w:ascii="Arial" w:hAnsi="Arial" w:eastAsia="SimSun"/>
+              </w:rPr>
+              <w:t>outputs/20260927_ddr_fraction_models/DDR/figures/figure3_manifold_projection.png/.pdf</w:t>
+            </w:r>
+          </w:p>
+        </w:tc>
+        <w:tc>
+          <w:tcPr>
+            <w:tcW w:type="dxa" w:w="2835"/>
+          </w:tcPr>
+          <w:p>
+            <w:pPr>
+              <w:spacing w:before="50" w:after="50"/>
+              <w:ind w:firstLine="0"/>
+              <w:jc w:val="center"/>
+            </w:pPr>
+            <w:r>
+              <w:rPr>
+                <w:rFonts w:ascii="Arial" w:hAnsi="Arial"/>
+                <w:b w:val="0"/>
+                <w:i w:val="0"/>
+                <w:sz w:val="19"/>
+                <w:rFonts w:ascii="Arial" w:hAnsi="Arial" w:eastAsia="SimSun"/>
+              </w:rPr>
+              <w:t>1,898 样本 DDR 目标转录组 UMAP 流形投影图</w:t>
+            </w:r>
+          </w:p>
+        </w:tc>
+      </w:tr>
+      <w:tr>
+        <w:tc>
+          <w:tcPr>
+            <w:tcW w:type="dxa" w:w="1587"/>
+          </w:tcPr>
+          <w:p>
+            <w:pPr>
+              <w:spacing w:before="50" w:after="50"/>
+              <w:ind w:firstLine="0"/>
+              <w:jc w:val="left"/>
+            </w:pPr>
+            <w:r>
+              <w:rPr>
+                <w:rFonts w:ascii="Arial" w:hAnsi="Arial"/>
+                <w:b w:val="0"/>
+                <w:i w:val="0"/>
+                <w:sz w:val="19"/>
+                <w:rFonts w:ascii="Arial" w:hAnsi="Arial" w:eastAsia="SimSun"/>
+              </w:rPr>
+              <w:t>DDR 残差图</w:t>
+            </w:r>
+          </w:p>
+        </w:tc>
+        <w:tc>
+          <w:tcPr>
+            <w:tcW w:type="dxa" w:w="4649"/>
+          </w:tcPr>
+          <w:p>
+            <w:pPr>
+              <w:spacing w:before="50" w:after="50"/>
+              <w:ind w:firstLine="0"/>
+              <w:jc w:val="center"/>
+            </w:pPr>
+            <w:r>
+              <w:rPr>
+                <w:rFonts w:ascii="Arial" w:hAnsi="Arial"/>
+                <w:b w:val="0"/>
+                <w:i w:val="0"/>
+                <w:sz w:val="19"/>
+                <w:rFonts w:ascii="Arial" w:hAnsi="Arial" w:eastAsia="SimSun"/>
+              </w:rPr>
+              <w:t>outputs/20260927_ddr_fraction_models/DDR/figures/figure4_residual_diagnostics.png/.pdf</w:t>
+            </w:r>
+          </w:p>
+        </w:tc>
+        <w:tc>
+          <w:tcPr>
+            <w:tcW w:type="dxa" w:w="2835"/>
+          </w:tcPr>
+          <w:p>
+            <w:pPr>
+              <w:spacing w:before="50" w:after="50"/>
+              <w:ind w:firstLine="0"/>
+              <w:jc w:val="center"/>
+            </w:pPr>
+            <w:r>
+              <w:rPr>
+                <w:rFonts w:ascii="Arial" w:hAnsi="Arial"/>
+                <w:b w:val="0"/>
+                <w:i w:val="0"/>
+                <w:sz w:val="19"/>
+                <w:rFonts w:ascii="Arial" w:hAnsi="Arial" w:eastAsia="SimSun"/>
+              </w:rPr>
+              <w:t>DDR 模型 LOESS 平滑残差与误差密度分布图</w:t>
+            </w:r>
+          </w:p>
+        </w:tc>
+      </w:tr>
+      <w:tr>
+        <w:tc>
+          <w:tcPr>
+            <w:tcW w:type="dxa" w:w="1587"/>
+          </w:tcPr>
+          <w:p>
+            <w:pPr>
+              <w:spacing w:before="50" w:after="50"/>
+              <w:ind w:firstLine="0"/>
+              <w:jc w:val="left"/>
+            </w:pPr>
+            <w:r>
+              <w:rPr>
+                <w:rFonts w:ascii="Arial" w:hAnsi="Arial"/>
+                <w:b w:val="0"/>
+                <w:i w:val="0"/>
+                <w:sz w:val="19"/>
+                <w:rFonts w:ascii="Arial" w:hAnsi="Arial" w:eastAsia="SimSun"/>
+              </w:rPr>
+              <w:t>DDR 分层散点</w:t>
+            </w:r>
+          </w:p>
+        </w:tc>
+        <w:tc>
+          <w:tcPr>
+            <w:tcW w:type="dxa" w:w="4649"/>
+          </w:tcPr>
+          <w:p>
+            <w:pPr>
+              <w:spacing w:before="50" w:after="50"/>
+              <w:ind w:firstLine="0"/>
+              <w:jc w:val="center"/>
+            </w:pPr>
+            <w:r>
+              <w:rPr>
+                <w:rFonts w:ascii="Arial" w:hAnsi="Arial"/>
+                <w:b w:val="0"/>
+                <w:i w:val="0"/>
+                <w:sz w:val="19"/>
+                <w:rFonts w:ascii="Arial" w:hAnsi="Arial" w:eastAsia="SimSun"/>
+              </w:rPr>
+              <w:t>outputs/20260927_ddr_fraction_models/DDR/figures/figure5_category_stratified.png/.pdf</w:t>
+            </w:r>
+          </w:p>
+        </w:tc>
+        <w:tc>
+          <w:tcPr>
+            <w:tcW w:type="dxa" w:w="2835"/>
+          </w:tcPr>
+          <w:p>
+            <w:pPr>
+              <w:spacing w:before="50" w:after="50"/>
+              <w:ind w:firstLine="0"/>
+              <w:jc w:val="center"/>
+            </w:pPr>
+            <w:r>
+              <w:rPr>
+                <w:rFonts w:ascii="Arial" w:hAnsi="Arial"/>
+                <w:b w:val="0"/>
+                <w:i w:val="0"/>
+                <w:sz w:val="19"/>
+                <w:rFonts w:ascii="Arial" w:hAnsi="Arial" w:eastAsia="SimSun"/>
+              </w:rPr>
+              <w:t>DDR 正常/癌组织与细胞系四象限盲测散点图</w:t>
             </w:r>
           </w:p>
         </w:tc>
@@ -5606,6 +6348,74 @@
                 <w:sz w:val="19"/>
                 <w:rFonts w:ascii="Arial" w:hAnsi="Arial" w:eastAsia="SimSun"/>
               </w:rPr>
+              <w:t>Repair 材料分布</w:t>
+            </w:r>
+          </w:p>
+        </w:tc>
+        <w:tc>
+          <w:tcPr>
+            <w:tcW w:type="dxa" w:w="4649"/>
+          </w:tcPr>
+          <w:p>
+            <w:pPr>
+              <w:spacing w:before="50" w:after="50"/>
+              <w:ind w:firstLine="0"/>
+              <w:jc w:val="center"/>
+            </w:pPr>
+            <w:r>
+              <w:rPr>
+                <w:rFonts w:ascii="Arial" w:hAnsi="Arial"/>
+                <w:b w:val="0"/>
+                <w:i w:val="0"/>
+                <w:sz w:val="19"/>
+                <w:rFonts w:ascii="Arial" w:hAnsi="Arial" w:eastAsia="SimSun"/>
+              </w:rPr>
+              <w:t>outputs/20260927_ddr_fraction_models/DNA_repair/figures/figure1_material_distributions.png/.pdf</w:t>
+            </w:r>
+          </w:p>
+        </w:tc>
+        <w:tc>
+          <w:tcPr>
+            <w:tcW w:type="dxa" w:w="2835"/>
+          </w:tcPr>
+          <w:p>
+            <w:pPr>
+              <w:spacing w:before="50" w:after="50"/>
+              <w:ind w:firstLine="0"/>
+              <w:jc w:val="center"/>
+            </w:pPr>
+            <w:r>
+              <w:rPr>
+                <w:rFonts w:ascii="Arial" w:hAnsi="Arial"/>
+                <w:b w:val="0"/>
+                <w:i w:val="0"/>
+                <w:sz w:val="19"/>
+                <w:rFonts w:ascii="Arial" w:hAnsi="Arial" w:eastAsia="SimSun"/>
+              </w:rPr>
+              <w:t>DNA repair 28 种材料预测分布与实测值对比图</w:t>
+            </w:r>
+          </w:p>
+        </w:tc>
+      </w:tr>
+      <w:tr>
+        <w:tc>
+          <w:tcPr>
+            <w:tcW w:type="dxa" w:w="1587"/>
+          </w:tcPr>
+          <w:p>
+            <w:pPr>
+              <w:spacing w:before="50" w:after="50"/>
+              <w:ind w:firstLine="0"/>
+              <w:jc w:val="left"/>
+            </w:pPr>
+            <w:r>
+              <w:rPr>
+                <w:rFonts w:ascii="Arial" w:hAnsi="Arial"/>
+                <w:b w:val="0"/>
+                <w:i w:val="0"/>
+                <w:sz w:val="19"/>
+                <w:rFonts w:ascii="Arial" w:hAnsi="Arial" w:eastAsia="SimSun"/>
+              </w:rPr>
               <w:t>Repair 特征图</w:t>
             </w:r>
           </w:p>
@@ -5651,6 +6461,210 @@
                 <w:rFonts w:ascii="Arial" w:hAnsi="Arial" w:eastAsia="SimSun"/>
               </w:rPr>
               <w:t>DNA repair 驱动特征 Top 25 排名条形图</w:t>
+            </w:r>
+          </w:p>
+        </w:tc>
+      </w:tr>
+      <w:tr>
+        <w:tc>
+          <w:tcPr>
+            <w:tcW w:type="dxa" w:w="1587"/>
+          </w:tcPr>
+          <w:p>
+            <w:pPr>
+              <w:spacing w:before="50" w:after="50"/>
+              <w:ind w:firstLine="0"/>
+              <w:jc w:val="left"/>
+            </w:pPr>
+            <w:r>
+              <w:rPr>
+                <w:rFonts w:ascii="Arial" w:hAnsi="Arial"/>
+                <w:b w:val="0"/>
+                <w:i w:val="0"/>
+                <w:sz w:val="19"/>
+                <w:rFonts w:ascii="Arial" w:hAnsi="Arial" w:eastAsia="SimSun"/>
+              </w:rPr>
+              <w:t>Repair 流形图</w:t>
+            </w:r>
+          </w:p>
+        </w:tc>
+        <w:tc>
+          <w:tcPr>
+            <w:tcW w:type="dxa" w:w="4649"/>
+          </w:tcPr>
+          <w:p>
+            <w:pPr>
+              <w:spacing w:before="50" w:after="50"/>
+              <w:ind w:firstLine="0"/>
+              <w:jc w:val="center"/>
+            </w:pPr>
+            <w:r>
+              <w:rPr>
+                <w:rFonts w:ascii="Arial" w:hAnsi="Arial"/>
+                <w:b w:val="0"/>
+                <w:i w:val="0"/>
+                <w:sz w:val="19"/>
+                <w:rFonts w:ascii="Arial" w:hAnsi="Arial" w:eastAsia="SimSun"/>
+              </w:rPr>
+              <w:t>outputs/20260927_ddr_fraction_models/DNA_repair/figures/figure3_manifold_projection.png/.pdf</w:t>
+            </w:r>
+          </w:p>
+        </w:tc>
+        <w:tc>
+          <w:tcPr>
+            <w:tcW w:type="dxa" w:w="2835"/>
+          </w:tcPr>
+          <w:p>
+            <w:pPr>
+              <w:spacing w:before="50" w:after="50"/>
+              <w:ind w:firstLine="0"/>
+              <w:jc w:val="center"/>
+            </w:pPr>
+            <w:r>
+              <w:rPr>
+                <w:rFonts w:ascii="Arial" w:hAnsi="Arial"/>
+                <w:b w:val="0"/>
+                <w:i w:val="0"/>
+                <w:sz w:val="19"/>
+                <w:rFonts w:ascii="Arial" w:hAnsi="Arial" w:eastAsia="SimSun"/>
+              </w:rPr>
+              <w:t>1,898 样本 Repair 目标转录组 UMAP 流形投影图</w:t>
+            </w:r>
+          </w:p>
+        </w:tc>
+      </w:tr>
+      <w:tr>
+        <w:tc>
+          <w:tcPr>
+            <w:tcW w:type="dxa" w:w="1587"/>
+          </w:tcPr>
+          <w:p>
+            <w:pPr>
+              <w:spacing w:before="50" w:after="50"/>
+              <w:ind w:firstLine="0"/>
+              <w:jc w:val="left"/>
+            </w:pPr>
+            <w:r>
+              <w:rPr>
+                <w:rFonts w:ascii="Arial" w:hAnsi="Arial"/>
+                <w:b w:val="0"/>
+                <w:i w:val="0"/>
+                <w:sz w:val="19"/>
+                <w:rFonts w:ascii="Arial" w:hAnsi="Arial" w:eastAsia="SimSun"/>
+              </w:rPr>
+              <w:t>Repair 残差图</w:t>
+            </w:r>
+          </w:p>
+        </w:tc>
+        <w:tc>
+          <w:tcPr>
+            <w:tcW w:type="dxa" w:w="4649"/>
+          </w:tcPr>
+          <w:p>
+            <w:pPr>
+              <w:spacing w:before="50" w:after="50"/>
+              <w:ind w:firstLine="0"/>
+              <w:jc w:val="center"/>
+            </w:pPr>
+            <w:r>
+              <w:rPr>
+                <w:rFonts w:ascii="Arial" w:hAnsi="Arial"/>
+                <w:b w:val="0"/>
+                <w:i w:val="0"/>
+                <w:sz w:val="19"/>
+                <w:rFonts w:ascii="Arial" w:hAnsi="Arial" w:eastAsia="SimSun"/>
+              </w:rPr>
+              <w:t>outputs/20260927_ddr_fraction_models/DNA_repair/figures/figure4_residual_diagnostics.png/.pdf</w:t>
+            </w:r>
+          </w:p>
+        </w:tc>
+        <w:tc>
+          <w:tcPr>
+            <w:tcW w:type="dxa" w:w="2835"/>
+          </w:tcPr>
+          <w:p>
+            <w:pPr>
+              <w:spacing w:before="50" w:after="50"/>
+              <w:ind w:firstLine="0"/>
+              <w:jc w:val="center"/>
+            </w:pPr>
+            <w:r>
+              <w:rPr>
+                <w:rFonts w:ascii="Arial" w:hAnsi="Arial"/>
+                <w:b w:val="0"/>
+                <w:i w:val="0"/>
+                <w:sz w:val="19"/>
+                <w:rFonts w:ascii="Arial" w:hAnsi="Arial" w:eastAsia="SimSun"/>
+              </w:rPr>
+              <w:t>DNA repair 模型残差与误差密度分布图</w:t>
+            </w:r>
+          </w:p>
+        </w:tc>
+      </w:tr>
+      <w:tr>
+        <w:tc>
+          <w:tcPr>
+            <w:tcW w:type="dxa" w:w="1587"/>
+          </w:tcPr>
+          <w:p>
+            <w:pPr>
+              <w:spacing w:before="50" w:after="50"/>
+              <w:ind w:firstLine="0"/>
+              <w:jc w:val="left"/>
+            </w:pPr>
+            <w:r>
+              <w:rPr>
+                <w:rFonts w:ascii="Arial" w:hAnsi="Arial"/>
+                <w:b w:val="0"/>
+                <w:i w:val="0"/>
+                <w:sz w:val="19"/>
+                <w:rFonts w:ascii="Arial" w:hAnsi="Arial" w:eastAsia="SimSun"/>
+              </w:rPr>
+              <w:t>Repair 分层散点</w:t>
+            </w:r>
+          </w:p>
+        </w:tc>
+        <w:tc>
+          <w:tcPr>
+            <w:tcW w:type="dxa" w:w="4649"/>
+          </w:tcPr>
+          <w:p>
+            <w:pPr>
+              <w:spacing w:before="50" w:after="50"/>
+              <w:ind w:firstLine="0"/>
+              <w:jc w:val="center"/>
+            </w:pPr>
+            <w:r>
+              <w:rPr>
+                <w:rFonts w:ascii="Arial" w:hAnsi="Arial"/>
+                <w:b w:val="0"/>
+                <w:i w:val="0"/>
+                <w:sz w:val="19"/>
+                <w:rFonts w:ascii="Arial" w:hAnsi="Arial" w:eastAsia="SimSun"/>
+              </w:rPr>
+              <w:t>outputs/20260927_ddr_fraction_models/DNA_repair/figures/figure5_category_stratified.png/.pdf</w:t>
+            </w:r>
+          </w:p>
+        </w:tc>
+        <w:tc>
+          <w:tcPr>
+            <w:tcW w:type="dxa" w:w="2835"/>
+          </w:tcPr>
+          <w:p>
+            <w:pPr>
+              <w:spacing w:before="50" w:after="50"/>
+              <w:ind w:firstLine="0"/>
+              <w:jc w:val="center"/>
+            </w:pPr>
+            <w:r>
+              <w:rPr>
+                <w:rFonts w:ascii="Arial" w:hAnsi="Arial"/>
+                <w:b w:val="0"/>
+                <w:i w:val="0"/>
+                <w:sz w:val="19"/>
+                <w:rFonts w:ascii="Arial" w:hAnsi="Arial" w:eastAsia="SimSun"/>
+              </w:rPr>
+              <w:t>DNA repair 四生物大类分层散点图</w:t>
             </w:r>
           </w:p>
         </w:tc>
@@ -5995,74 +7009,6 @@
           </w:p>
         </w:tc>
       </w:tr>
-      <w:tr>
-        <w:tc>
-          <w:tcPr>
-            <w:tcW w:type="dxa" w:w="1587"/>
-          </w:tcPr>
-          <w:p>
-            <w:pPr>
-              <w:spacing w:before="50" w:after="50"/>
-              <w:ind w:firstLine="0"/>
-              <w:jc w:val="left"/>
-            </w:pPr>
-            <w:r>
-              <w:rPr>
-                <w:rFonts w:ascii="Arial" w:hAnsi="Arial"/>
-                <w:b w:val="0"/>
-                <w:i w:val="0"/>
-                <w:sz w:val="19"/>
-                <w:rFonts w:ascii="Arial" w:hAnsi="Arial" w:eastAsia="SimSun"/>
-              </w:rPr>
-              <w:t>外部数据报告</w:t>
-            </w:r>
-          </w:p>
-        </w:tc>
-        <w:tc>
-          <w:tcPr>
-            <w:tcW w:type="dxa" w:w="4649"/>
-          </w:tcPr>
-          <w:p>
-            <w:pPr>
-              <w:spacing w:before="50" w:after="50"/>
-              <w:ind w:firstLine="0"/>
-              <w:jc w:val="center"/>
-            </w:pPr>
-            <w:r>
-              <w:rPr>
-                <w:rFonts w:ascii="Arial" w:hAnsi="Arial"/>
-                <w:b w:val="0"/>
-                <w:i w:val="0"/>
-                <w:sz w:val="19"/>
-                <w:rFonts w:ascii="Arial" w:hAnsi="Arial" w:eastAsia="SimSun"/>
-              </w:rPr>
-              <w:t>workflow/external_material/README.md</w:t>
-            </w:r>
-          </w:p>
-        </w:tc>
-        <w:tc>
-          <w:tcPr>
-            <w:tcW w:type="dxa" w:w="2835"/>
-          </w:tcPr>
-          <w:p>
-            <w:pPr>
-              <w:spacing w:before="50" w:after="50"/>
-              <w:ind w:firstLine="0"/>
-              <w:jc w:val="center"/>
-            </w:pPr>
-            <w:r>
-              <w:rPr>
-                <w:rFonts w:ascii="Arial" w:hAnsi="Arial"/>
-                <w:b w:val="0"/>
-                <w:i w:val="0"/>
-                <w:sz w:val="19"/>
-                <w:rFonts w:ascii="Arial" w:hAnsi="Arial" w:eastAsia="SimSun"/>
-              </w:rPr>
-              <w:t>PXD063945 与 GSE130078 数据获取与处理详细复现记录</w:t>
-            </w:r>
-          </w:p>
-        </w:tc>
-      </w:tr>
     </w:tbl>
     <w:p>
       <w:pPr>

</xml_diff>